<commit_message>
add data matrices for convenience, fix figure 4 report of regression
</commit_message>
<xml_diff>
--- a/docs/Manuscript_Formatted.docx
+++ b/docs/Manuscript_Formatted.docx
@@ -157,15 +157,28 @@
         </w:rPr>
         <w:t>Miguel Castelo-Branco (</w:t>
       </w:r>
-      <w:hyperlink>
-        <w:r>
-          <w:rPr>
-            <w:rStyle w:val="Hyperlink"/>
-            <w:lang w:val="pt-PT"/>
-          </w:rPr>
-          <w:t>mcbranco@fmed.uc.pt</w:t>
-        </w:r>
-      </w:hyperlink>
+      <w:r>
+        <w:fldChar w:fldCharType="begin"/>
+      </w:r>
+      <w:r>
+        <w:rPr>
+          <w:lang w:val="pt-PT"/>
+        </w:rPr>
+        <w:instrText>HYPERLINK \h</w:instrText>
+      </w:r>
+      <w:r>
+        <w:fldChar w:fldCharType="separate"/>
+      </w:r>
+      <w:r>
+        <w:rPr>
+          <w:rStyle w:val="Hyperlink"/>
+          <w:lang w:val="pt-PT"/>
+        </w:rPr>
+        <w:t>mcbranco@fmed.uc.pt</w:t>
+      </w:r>
+      <w:r>
+        <w:fldChar w:fldCharType="end"/>
+      </w:r>
       <w:r>
         <w:rPr>
           <w:lang w:val="pt-PT"/>
@@ -2137,15 +2150,7 @@
     <w:p/>
     <w:p>
       <w:r>
-        <w:t>The first task is a localizer for the region of interest - hMT+. For this purpose, we created three conditions: i. ‘Fixation’ - a fixation cross; ii. ‘Static plaid’ - a stationary plaid; iii. ‘</w:t>
-      </w:r>
-      <w:proofErr w:type="gramStart"/>
-      <w:r>
-        <w:t>moving</w:t>
-      </w:r>
-      <w:proofErr w:type="gramEnd"/>
-      <w:r>
-        <w:t xml:space="preserve"> plaid’ - a moving plaid, which is inherently a bistable stimulus. The run lasted for 2.9 min and was composed of nine trials with the sequential presentation of each condition for 6 seconds. We used the sequence with TR = 1 s for this paradigm.</w:t>
+        <w:t>The first task is a localizer for the region of interest - hMT+. For this purpose, we created three conditions: i. ‘Fixation’ - a fixation cross; ii. ‘Static plaid’ - a stationary plaid; iii. ‘moving plaid’ - a moving plaid, which is inherently a bistable stimulus. The run lasted for 2.9 min and was composed of nine trials with the sequential presentation of each condition for 6 seconds. We used the sequence with TR = 1 s for this paradigm.</w:t>
       </w:r>
     </w:p>
     <w:p>
@@ -2164,15 +2169,7 @@
       </w:r>
       <w:r>
         <w:lastRenderedPageBreak/>
-        <w:t xml:space="preserve">the stimulus is entirely ambiguous (the percept alternates between coherent and incoherent). Here, the participants were instructed to report the perceived type of motion (coherent or incoherent) using two buttons of a response box. During the unambiguous runs, the plaid is shown with overlaid dots moving either coherently down or incoherently inwards, which disambiguates the perception of the plaid. Based on the responses given by the participant in the previous ambiguous run, we manipulated the switches between coherent and incoherent motion in the unambiguous runs to match the previous responses precisely. This matched the time of each percept across both types of runs. The participants received the same instruction - to </w:t>
-      </w:r>
-      <w:proofErr w:type="gramStart"/>
-      <w:r>
-        <w:t>report the perceived type of motion at all times</w:t>
-      </w:r>
-      <w:proofErr w:type="gramEnd"/>
-      <w:r>
-        <w:t>. We ran the two tasks with each of the four MR sequences, totaling eight runs per participant.</w:t>
+        <w:t>the stimulus is entirely ambiguous (the percept alternates between coherent and incoherent). Here, the participants were instructed to report the perceived type of motion (coherent or incoherent) using two buttons of a response box. During the unambiguous runs, the plaid is shown with overlaid dots moving either coherently down or incoherently inwards, which disambiguates the perception of the plaid. Based on the responses given by the participant in the previous ambiguous run, we manipulated the switches between coherent and incoherent motion in the unambiguous runs to match the previous responses precisely. This matched the time of each percept across both types of runs. The participants received the same instruction - to report the perceived type of motion at all times. We ran the two tasks with each of the four MR sequences, totaling eight runs per participant.</w:t>
       </w:r>
     </w:p>
     <w:p>
@@ -2469,15 +2466,7 @@
     </w:p>
     <w:p>
       <w:r>
-        <w:t xml:space="preserve">We then used a different design matrix, replacing the ‘motion’ predictor with predictors for coherent and incoherent percepts. As in the previous model, we extract the </w:t>
-      </w:r>
-      <w:proofErr w:type="gramStart"/>
-      <w:r>
-        <w:t>ROI  beta</w:t>
-      </w:r>
-      <w:proofErr w:type="gramEnd"/>
-      <w:r>
-        <w:t xml:space="preserve"> statistic and t-value for the contrasts between coherent/incoherent and static plaid.</w:t>
+        <w:t>We then used a different design matrix, replacing the ‘motion’ predictor with predictors for coherent and incoherent percepts. As in the previous model, we extract the ROI  beta statistic and t-value for the contrasts between coherent/incoherent and static plaid.</w:t>
       </w:r>
     </w:p>
     <w:p>
@@ -2528,31 +2517,7 @@
     </w:p>
     <w:p>
       <w:r>
-        <w:t xml:space="preserve">We defined the left and right hMT+ ROIs in the localizer map of </w:t>
-      </w:r>
-      <w:proofErr w:type="gramStart"/>
-      <w:r>
-        <w:t>each individual</w:t>
-      </w:r>
-      <w:proofErr w:type="gramEnd"/>
-      <w:r>
-        <w:t>, considering the contrast ‘moving’ vs. ‘static’, a voxel-wise correction with Bonferroni’s method (p=0.05), and cluster-wise with a minimum cluster size of 50 voxels (Figure 2). The MNI coordinates of the center of the left and right hMT+ clusters for each subject are reported in Table S2. The group activation map is shown in Figure S3, and the average MNI coordinates of the center of the left and right clusters are (-</w:t>
-      </w:r>
-      <w:proofErr w:type="gramStart"/>
-      <w:r>
-        <w:t>42,-</w:t>
-      </w:r>
-      <w:proofErr w:type="gramEnd"/>
-      <w:r>
-        <w:t>72,4) and (</w:t>
-      </w:r>
-      <w:proofErr w:type="gramStart"/>
-      <w:r>
-        <w:t>48,-</w:t>
-      </w:r>
-      <w:proofErr w:type="gramEnd"/>
-      <w:r>
-        <w:t>66,6), respectively.</w:t>
+        <w:t>We defined the left and right hMT+ ROIs in the localizer map of each individual, considering the contrast ‘moving’ vs. ‘static’, a voxel-wise correction with Bonferroni’s method (p=0.05), and cluster-wise with a minimum cluster size of 50 voxels (Figure 2). The MNI coordinates of the center of the left and right hMT+ clusters for each subject are reported in Table S2. The group activation map is shown in Figure S3, and the average MNI coordinates of the center of the left and right clusters are (-42,-72,4) and (48,-66,6), respectively.</w:t>
       </w:r>
     </w:p>
     <w:p>
@@ -2621,15 +2586,7 @@
     </w:p>
     <w:p>
       <w:r>
-        <w:t xml:space="preserve">Activation profiles were analyzed using GLMs applied to the normalized BOLD signals from the motion runs (the average BOLD time courses are shown in Supplementary Figures S4 and S5). Figure 3 presents the results of the GLM analyses across different TR values, showing that they are essentially the same across TRs, and can be pooled across TRs. In the first column, we plot the beta and t-values of the contrast ‘motion vs. static’. There is no difference in the beta values between TRs, </w:t>
-      </w:r>
-      <w:proofErr w:type="gramStart"/>
-      <w:r>
-        <w:t>in spite of</w:t>
-      </w:r>
-      <w:proofErr w:type="gramEnd"/>
-      <w:r>
-        <w:t xml:space="preserve"> larger t values for the lowest TRs. Similar findings were found for the coherent and incoherent contrasts.</w:t>
+        <w:t>Activation profiles were analyzed using GLMs applied to the normalized BOLD signals from the motion runs (the average BOLD time courses are shown in Supplementary Figures S4 and S5). Figure 3 presents the results of the GLM analyses across different TR values, showing that they are essentially the same across TRs, and can be pooled across TRs. In the first column, we plot the beta and t-values of the contrast ‘motion vs. static’. There is no difference in the beta values between TRs, in spite of larger t values for the lowest TRs. Similar findings were found for the coherent and incoherent contrasts.</w:t>
       </w:r>
     </w:p>
     <w:p/>
@@ -2714,14 +2671,11 @@
         <w:t xml:space="preserve"> </w:t>
       </w:r>
       <w:r>
-        <w:rPr>
-          <w:noProof/>
-        </w:rPr>
         <w:drawing>
-          <wp:inline distT="0" distB="0" distL="0" distR="0" wp14:anchorId="4F43B3A9" wp14:editId="73502C10">
-            <wp:extent cx="5731510" cy="3011170"/>
-            <wp:effectExtent l="0" t="0" r="0" b="0"/>
-            <wp:docPr id="1007" name="Image2" descr="A collage of graphs  AI-generated content may be incorrect."/>
+          <wp:inline distT="0" distB="0" distL="0" distR="0" wp14:anchorId="02FB2173" wp14:editId="58D1A3B8">
+            <wp:extent cx="6208395" cy="3263900"/>
+            <wp:effectExtent l="0" t="0" r="1905" b="0"/>
+            <wp:docPr id="2063772820" name="Picture 1"/>
             <wp:cNvGraphicFramePr>
               <a:graphicFrameLocks xmlns:a="http://schemas.openxmlformats.org/drawingml/2006/main" noChangeAspect="1"/>
             </wp:cNvGraphicFramePr>
@@ -2729,10 +2683,8 @@
               <a:graphicData uri="http://schemas.openxmlformats.org/drawingml/2006/picture">
                 <pic:pic xmlns:pic="http://schemas.openxmlformats.org/drawingml/2006/picture">
                   <pic:nvPicPr>
-                    <pic:cNvPr id="1008" name="Image2" descr="A collage of graphs  AI-generated content may be incorrect."/>
-                    <pic:cNvPicPr>
-                      <a:picLocks noChangeAspect="1" noChangeArrowheads="1"/>
-                    </pic:cNvPicPr>
+                    <pic:cNvPr id="2063772820" name=""/>
+                    <pic:cNvPicPr/>
                   </pic:nvPicPr>
                   <pic:blipFill>
                     <a:blip r:embed="rId15"/>
@@ -2740,15 +2692,14 @@
                       <a:fillRect/>
                     </a:stretch>
                   </pic:blipFill>
-                  <pic:spPr bwMode="auto">
+                  <pic:spPr>
                     <a:xfrm>
                       <a:off x="0" y="0"/>
-                      <a:ext cx="5731510" cy="3011170"/>
+                      <a:ext cx="6208395" cy="3263900"/>
                     </a:xfrm>
                     <a:prstGeom prst="rect">
                       <a:avLst/>
                     </a:prstGeom>
-                    <a:noFill/>
                   </pic:spPr>
                 </pic:pic>
               </a:graphicData>
@@ -3410,7 +3361,37 @@
     </w:p>
     <w:p>
       <w:r>
-        <w:t>The datasets generated and analyzed for this study, together with the analysis code, can be found in the [REPOSITORY NAME] repository: [LINK].</w:t>
+        <w:t xml:space="preserve">The datasets generated and analyzed for this study, </w:t>
+      </w:r>
+      <w:r>
+        <w:t>along</w:t>
+      </w:r>
+      <w:r>
+        <w:t xml:space="preserve"> with the analysis code, </w:t>
+      </w:r>
+      <w:r>
+        <w:t>ar</w:t>
+      </w:r>
+      <w:r>
+        <w:t xml:space="preserve">e </w:t>
+      </w:r>
+      <w:r>
+        <w:t>available</w:t>
+      </w:r>
+      <w:r>
+        <w:t xml:space="preserve"> in the</w:t>
+      </w:r>
+      <w:r>
+        <w:t xml:space="preserve"> GitHub</w:t>
+      </w:r>
+      <w:r>
+        <w:t xml:space="preserve"> repository: </w:t>
+      </w:r>
+      <w:r>
+        <w:t>https://github.com/CIBIT-UC/vpmbtr</w:t>
+      </w:r>
+      <w:r>
+        <w:t>.</w:t>
       </w:r>
     </w:p>
     <w:p>
@@ -8338,6 +8319,10 @@
 </file>
 
 <file path=customXml/item1.xml><?xml version="1.0" encoding="utf-8"?>
+<b:Sources xmlns:b="http://schemas.openxmlformats.org/officeDocument/2006/bibliography" xmlns="http://schemas.openxmlformats.org/officeDocument/2006/bibliography" SelectedStyle="\CHICAGO.XSL" StyleName="Chicago"/>
+</file>
+
+<file path=customXml/item2.xml><?xml version="1.0" encoding="utf-8"?>
 <p:properties xmlns:p="http://schemas.microsoft.com/office/2006/metadata/properties" xmlns:xsi="http://www.w3.org/2001/XMLSchema-instance" xmlns:pc="http://schemas.microsoft.com/office/infopath/2007/PartnerControls">
   <documentManagement>
     <_dlc_DocId xmlns="26005759-6815-4540-b8ea-913958d74f23">FRONDOC-1086935359-10120</_dlc_DocId>
@@ -8371,7 +8356,7 @@
 </p:properties>
 </file>
 
-<file path=customXml/item2.xml><?xml version="1.0" encoding="utf-8"?>
+<file path=customXml/item3.xml><?xml version="1.0" encoding="utf-8"?>
 <?mso-contentType ?>
 <spe:Receivers xmlns:spe="http://schemas.microsoft.com/sharepoint/events">
   <Receiver>
@@ -8421,7 +8406,7 @@
 </spe:Receivers>
 </file>
 
-<file path=customXml/item3.xml><?xml version="1.0" encoding="utf-8"?>
+<file path=customXml/item4.xml><?xml version="1.0" encoding="utf-8"?>
 <ct:contentTypeSchema xmlns:ct="http://schemas.microsoft.com/office/2006/metadata/contentType" xmlns:ma="http://schemas.microsoft.com/office/2006/metadata/properties/metaAttributes" ct:_="" ma:_="" ma:contentTypeName="Document" ma:contentTypeID="0x01010026445AF306EBB441B7A6158762C40D43" ma:contentTypeVersion="28" ma:contentTypeDescription="Create a new document." ma:contentTypeScope="" ma:versionID="6fd1d3709ebdae3c6e0eeb2d23db798b">
   <xsd:schema xmlns:xsd="http://www.w3.org/2001/XMLSchema" xmlns:xs="http://www.w3.org/2001/XMLSchema" xmlns:p="http://schemas.microsoft.com/office/2006/metadata/properties" xmlns:ns2="26005759-6815-4540-b8ea-913958d74f23" xmlns:ns3="970c08f3-bdc0-46be-888b-e62464d9f78c" targetNamespace="http://schemas.microsoft.com/office/2006/metadata/properties" ma:root="true" ma:fieldsID="830d6d9b807b871f8ec19ed92d251fd0" ns2:_="" ns3:_="">
     <xsd:import namespace="26005759-6815-4540-b8ea-913958d74f23"/>
@@ -8723,7 +8708,7 @@
 </ct:contentTypeSchema>
 </file>
 
-<file path=customXml/item4.xml><?xml version="1.0" encoding="utf-8"?>
+<file path=customXml/item5.xml><?xml version="1.0" encoding="utf-8"?>
 <?mso-contentType ?>
 <FormTemplates xmlns="http://schemas.microsoft.com/sharepoint/v3/contenttype/forms">
   <Display>DocumentLibraryForm</Display>
@@ -8732,11 +8717,15 @@
 </FormTemplates>
 </file>
 
-<file path=customXml/item5.xml><?xml version="1.0" encoding="utf-8"?>
-<b:Sources xmlns:b="http://schemas.openxmlformats.org/officeDocument/2006/bibliography" xmlns="http://schemas.openxmlformats.org/officeDocument/2006/bibliography" SelectedStyle="\CHICAGO.XSL" StyleName="Chicago"/>
+<file path=customXml/itemProps1.xml><?xml version="1.0" encoding="utf-8"?>
+<ds:datastoreItem xmlns:ds="http://schemas.openxmlformats.org/officeDocument/2006/customXml" ds:itemID="{5F9F80FA-172A-49E6-812C-44A6388DD2F9}">
+  <ds:schemaRefs>
+    <ds:schemaRef ds:uri="http://schemas.openxmlformats.org/officeDocument/2006/bibliography"/>
+  </ds:schemaRefs>
+</ds:datastoreItem>
 </file>
 
-<file path=customXml/itemProps1.xml><?xml version="1.0" encoding="utf-8"?>
+<file path=customXml/itemProps2.xml><?xml version="1.0" encoding="utf-8"?>
 <ds:datastoreItem xmlns:ds="http://schemas.openxmlformats.org/officeDocument/2006/customXml" ds:itemID="{C80633FE-2C4D-43D3-9027-7B70B5BC8799}">
   <ds:schemaRefs>
     <ds:schemaRef ds:uri="http://schemas.microsoft.com/office/2006/metadata/properties"/>
@@ -8747,7 +8736,7 @@
 </ds:datastoreItem>
 </file>
 
-<file path=customXml/itemProps2.xml><?xml version="1.0" encoding="utf-8"?>
+<file path=customXml/itemProps3.xml><?xml version="1.0" encoding="utf-8"?>
 <ds:datastoreItem xmlns:ds="http://schemas.openxmlformats.org/officeDocument/2006/customXml" ds:itemID="{51F9E78B-9130-4244-A349-202827F2937E}">
   <ds:schemaRefs>
     <ds:schemaRef ds:uri="http://schemas.microsoft.com/sharepoint/events"/>
@@ -8755,7 +8744,7 @@
 </ds:datastoreItem>
 </file>
 
-<file path=customXml/itemProps3.xml><?xml version="1.0" encoding="utf-8"?>
+<file path=customXml/itemProps4.xml><?xml version="1.0" encoding="utf-8"?>
 <ds:datastoreItem xmlns:ds="http://schemas.openxmlformats.org/officeDocument/2006/customXml" ds:itemID="{37D19558-80B8-407F-9A85-A5582859BFC5}">
   <ds:schemaRefs>
     <ds:schemaRef ds:uri="http://schemas.microsoft.com/office/2006/metadata/contentType"/>
@@ -8774,18 +8763,10 @@
 </ds:datastoreItem>
 </file>
 
-<file path=customXml/itemProps4.xml><?xml version="1.0" encoding="utf-8"?>
+<file path=customXml/itemProps5.xml><?xml version="1.0" encoding="utf-8"?>
 <ds:datastoreItem xmlns:ds="http://schemas.openxmlformats.org/officeDocument/2006/customXml" ds:itemID="{A547FD6E-73F0-4542-8474-D6680317EFD1}">
   <ds:schemaRefs>
     <ds:schemaRef ds:uri="http://schemas.microsoft.com/sharepoint/v3/contenttype/forms"/>
   </ds:schemaRefs>
 </ds:datastoreItem>
-</file>
-
-<file path=customXml/itemProps5.xml><?xml version="1.0" encoding="utf-8"?>
-<ds:datastoreItem xmlns:ds="http://schemas.openxmlformats.org/officeDocument/2006/customXml" ds:itemID="{5F9F80FA-172A-49E6-812C-44A6388DD2F9}">
-  <ds:schemaRefs>
-    <ds:schemaRef ds:uri="http://schemas.openxmlformats.org/officeDocument/2006/bibliography"/>
-  </ds:schemaRefs>
-</ds:datastoreItem>
 </file>
</xml_diff>